<commit_message>
Add student information to Practical 9
</commit_message>
<xml_diff>
--- a/P9/pract-9-awdf-24CS091.docx
+++ b/P9/pract-9-awdf-24CS091.docx
@@ -3526,6 +3526,44 @@
           <w:szCs w:val="24"/>
         </w:rPr>
       </w:pPr>
+    </w:p>
+    <w:p>
+      <w:pPr>
+        <w:pStyle w:val="2"/>
+      </w:pPr>
+      <w:r>
+        <w:t>Student Information</w:t>
+      </w:r>
+    </w:p>
+    <w:p>
+      <w:r>
+        <w:t>Name: Divyata Savaj</w:t>
+      </w:r>
+    </w:p>
+    <w:p>
+      <w:r>
+        <w:t>ID: 24CS091</w:t>
+      </w:r>
+    </w:p>
+    <w:p>
+      <w:r>
+        <w:t>Email: 24cs091@charusat.edu.in</w:t>
+      </w:r>
+    </w:p>
+    <w:p>
+      <w:r>
+        <w:t>Semester: 5th Semester</w:t>
+      </w:r>
+    </w:p>
+    <w:p>
+      <w:r>
+        <w:t>Program: B.Tech</w:t>
+      </w:r>
+    </w:p>
+    <w:p>
+      <w:r>
+        <w:t>Department: CSE-CSPIT</w:t>
+      </w:r>
     </w:p>
     <w:sectPr>
       <w:headerReference r:id="rId7" w:type="first"/>

</xml_diff>

<commit_message>
Regenerate detailed Word report for Practical 9
</commit_message>
<xml_diff>
--- a/P9/pract-9-awdf-24CS091.docx
+++ b/P9/pract-9-awdf-24CS091.docx
@@ -3101,15 +3101,14 @@
             <w:pPr>
               <w:jc w:val="left"/>
             </w:pPr>
-            <w:r>
-              <w:t>GitHub Link Repository Link: https://github.com/DivyataSavaj/24cs091-awdf-practical9</w:t>
-            </w:r>
+            <w:r/>
             <w:r>
               <w:rPr>
                 <w:rFonts w:ascii="Times New Roman" w:hAnsi="Times New Roman"/>
                 <w:b/>
                 <w:sz w:val="22"/>
               </w:rPr>
+              <w:t xml:space="preserve">GitHub Link Repository Link: </w:t>
             </w:r>
             <w:r>
               <w:rPr>
@@ -3117,6 +3116,7 @@
                 <w:b/>
                 <w:sz w:val="22"/>
               </w:rPr>
+              <w:t>https://github.com/DivyataSavaj/24cs091-awdf-practical9</w:t>
             </w:r>
           </w:p>
         </w:tc>
@@ -3532,7 +3532,7 @@
         <w:pStyle w:val="2"/>
       </w:pPr>
       <w:r>
-        <w:t>Student Information</w:t>
+        <w:t>Academic Details</w:t>
       </w:r>
     </w:p>
     <w:p>
@@ -3542,7 +3542,7 @@
     </w:p>
     <w:p>
       <w:r>
-        <w:t>ID: 24CS091</w:t>
+        <w:t>Student ID: 24CS091</w:t>
       </w:r>
     </w:p>
     <w:p>

</xml_diff>